<commit_message>
Updated the document, just need to switch in the propper files
</commit_message>
<xml_diff>
--- a/horribleCodeActivity.docx
+++ b/horribleCodeActivity.docx
@@ -1,92 +1,56 @@
 
 <file path=word/document.xml><?xml version="1.0" encoding="utf-8"?>
-<w:document xmlns:mc="http://schemas.openxmlformats.org/markup-compatibility/2006" xmlns:o="urn:schemas-microsoft-com:office:office" xmlns:r="http://schemas.openxmlformats.org/officeDocument/2006/relationships" xmlns:m="http://schemas.openxmlformats.org/officeDocument/2006/math" xmlns:v="urn:schemas-microsoft-com:vml" xmlns:wp="http://schemas.openxmlformats.org/drawingml/2006/wordprocessingDrawing" xmlns:w10="urn:schemas-microsoft-com:office:word" xmlns:w="http://schemas.openxmlformats.org/wordprocessingml/2006/main" xmlns:wne="http://schemas.microsoft.com/office/word/2006/wordml" xmlns:sl="http://schemas.openxmlformats.org/schemaLibrary/2006/main" xmlns:a="http://schemas.openxmlformats.org/drawingml/2006/main" xmlns:pic="http://schemas.openxmlformats.org/drawingml/2006/picture" xmlns:c="http://schemas.openxmlformats.org/drawingml/2006/chart" xmlns:lc="http://schemas.openxmlformats.org/drawingml/2006/lockedCanvas" xmlns:dgm="http://schemas.openxmlformats.org/drawingml/2006/diagram" xmlns:wps="http://schemas.microsoft.com/office/word/2010/wordprocessingShape" xmlns:wpg="http://schemas.microsoft.com/office/word/2010/wordprocessingGroup" xmlns:w14="http://schemas.microsoft.com/office/word/2010/wordml" xmlns:w15="http://schemas.microsoft.com/office/word/2012/wordml" xmlns:w16="http://schemas.microsoft.com/office/word/2018/wordml" xmlns:w16cex="http://schemas.microsoft.com/office/word/2018/wordml/cex" xmlns:w16cid="http://schemas.microsoft.com/office/word/2016/wordml/cid" xmlns="http://schemas.microsoft.com/office/tasks/2019/documenttasks" xmlns:cr="http://schemas.microsoft.com/office/comments/2020/reactions">
+<w:document xmlns:wpc="http://schemas.microsoft.com/office/word/2010/wordprocessingCanvas" xmlns:cx="http://schemas.microsoft.com/office/drawing/2014/chartex" xmlns:cx1="http://schemas.microsoft.com/office/drawing/2015/9/8/chartex" xmlns:cx2="http://schemas.microsoft.com/office/drawing/2015/10/21/chartex" xmlns:cx3="http://schemas.microsoft.com/office/drawing/2016/5/9/chartex" xmlns:cx4="http://schemas.microsoft.com/office/drawing/2016/5/10/chartex" xmlns:cx5="http://schemas.microsoft.com/office/drawing/2016/5/11/chartex" xmlns:cx6="http://schemas.microsoft.com/office/drawing/2016/5/12/chartex" xmlns:cx7="http://schemas.microsoft.com/office/drawing/2016/5/13/chartex" xmlns:cx8="http://schemas.microsoft.com/office/drawing/2016/5/14/chartex" xmlns:mc="http://schemas.openxmlformats.org/markup-compatibility/2006" xmlns:aink="http://schemas.microsoft.com/office/drawing/2016/ink" xmlns:am3d="http://schemas.microsoft.com/office/drawing/2017/model3d" xmlns:o="urn:schemas-microsoft-com:office:office" xmlns:oel="http://schemas.microsoft.com/office/2019/extlst" xmlns:r="http://schemas.openxmlformats.org/officeDocument/2006/relationships" xmlns:m="http://schemas.openxmlformats.org/officeDocument/2006/math" xmlns:v="urn:schemas-microsoft-com:vml" xmlns:wp14="http://schemas.microsoft.com/office/word/2010/wordprocessingDrawing" xmlns:wp="http://schemas.openxmlformats.org/drawingml/2006/wordprocessingDrawing" xmlns:w10="urn:schemas-microsoft-com:office:word" xmlns:w="http://schemas.openxmlformats.org/wordprocessingml/2006/main" xmlns:w14="http://schemas.microsoft.com/office/word/2010/wordml" xmlns:w15="http://schemas.microsoft.com/office/word/2012/wordml" xmlns:w16cex="http://schemas.microsoft.com/office/word/2018/wordml/cex" xmlns:w16cid="http://schemas.microsoft.com/office/word/2016/wordml/cid" xmlns:w16="http://schemas.microsoft.com/office/word/2018/wordml" xmlns:w16du="http://schemas.microsoft.com/office/word/2023/wordml/word16du" xmlns:w16sdtdh="http://schemas.microsoft.com/office/word/2020/wordml/sdtdatahash" xmlns:w16se="http://schemas.microsoft.com/office/word/2015/wordml/symex" xmlns:wpg="http://schemas.microsoft.com/office/word/2010/wordprocessingGroup" xmlns:wpi="http://schemas.microsoft.com/office/word/2010/wordprocessingInk" xmlns:wne="http://schemas.microsoft.com/office/word/2006/wordml" xmlns:wps="http://schemas.microsoft.com/office/word/2010/wordprocessingShape" mc:Ignorable="w14 w15 w16se w16cid w16 w16cex w16sdtdh w16du wp14">
   <w:body>
     <w:p>
-      <w:pPr>
-        <w:rPr/>
-      </w:pPr>
       <w:r>
-        <w:rPr>
-          <w:rtl w:val="0"/>
-        </w:rPr>
-        <w:t xml:space="preserve">Using theses principles: Seperation of concern, document your code, and clean code</w:t>
+        <w:t>Using theses principles: Seperation of concern, document your code, and clean code</w:t>
       </w:r>
     </w:p>
+    <w:p/>
+    <w:p/>
     <w:p>
-      <w:pPr>
-        <w:rPr/>
-      </w:pPr>
       <w:r>
-        <w:rPr>
-          <w:rtl w:val="0"/>
-        </w:rPr>
+        <w:t>Hello, for this activity, I designed an in-terminal calculator, which allows users to perform calculations including addition/subtraction and multiplication/division.</w:t>
       </w:r>
     </w:p>
+    <w:p/>
     <w:p>
-      <w:pPr>
-        <w:rPr/>
-      </w:pPr>
       <w:r>
-        <w:rPr>
-          <w:rtl w:val="0"/>
-        </w:rPr>
+        <w:t>For my properly written code (calculator.</w:t>
       </w:r>
-    </w:p>
-    <w:p>
-      <w:pPr>
-        <w:rPr/>
-      </w:pPr>
       <w:r>
-        <w:rPr>
-          <w:rtl w:val="0"/>
-        </w:rPr>
-        <w:t xml:space="preserve">Hello, for this activity, I designed an in-terminal calculator, which allows users to perform calculations including addition/subtraction and multiplication/division.</w:t>
+        <w:t>py</w:t>
       </w:r>
-    </w:p>
-    <w:p>
-      <w:pPr>
-        <w:rPr/>
-      </w:pPr>
       <w:r>
-        <w:rPr>
-          <w:rtl w:val="0"/>
-        </w:rPr>
+        <w:t>) I focused on clear and concise code with good comments and well separated functions which make the code easily readable, and if an error were to occur it can be quickly located and corrected. I surpassed having three functions, and instead had four, separating addition, subtraction, multiplication, and division into their own functions that can be called by the main function depending on what the user selects in terminal. I then used a switch function which allows for these individual functions to be called and employed. I utilized separation of concerns by separating these smaller functions from the main function, I employed propper documentation of code through comments above each function, and lastly I made sure to remove any unnecessary snippets of code to keep everything concise. For the horrible code (calc.</w:t>
       </w:r>
-    </w:p>
-    <w:p>
-      <w:pPr>
-        <w:rPr/>
-      </w:pPr>
       <w:r>
-        <w:rPr>
-          <w:rtl w:val="0"/>
-        </w:rPr>
-        <w:t xml:space="preserve">For my properly written code (calculator.c) I focused on clear and concise code with good comments and well separated functions which make the code easily readable, and if an error were to occur it can be quickly located and corrected. I surpassed having three functions, and instead had four, separating addition, subtraction, multiplication, and division into their own functions that can be called by the main function depending on what the user selects in terminal. I then used a switch function which allows for these individual functions to be called and employed. I utilized separation of concerns by separating these smaller functions from the main function, I employed propper documentation of code through comments above each function, and lastly I made sure to remove any unnecessary snippets of code to keep everything concise. For the horrible code (calc.c) I scrapped the documentation entirely, bundled the functions into one main function, and I made sure the code was not clean by intentionally swapping the switch statement to if statements and adding essentially pointless/sloppy separation.</w:t>
+        <w:t>py</w:t>
+      </w:r>
+      <w:r>
+        <w:t>) I scrapped the documentation entirely, bundled the functions into one main function, and I made sure the code was not clean by intentionally swapping the switch statement to if statements and adding essentially pointless/sloppy separation.</w:t>
       </w:r>
     </w:p>
     <w:sectPr>
-      <w:pgSz w:h="15840" w:w="12240" w:orient="portrait"/>
-      <w:pgMar w:bottom="1440" w:top="1440" w:left="1440" w:right="1440" w:header="720" w:footer="720"/>
+      <w:pgSz w:w="12240" w:h="15840"/>
+      <w:pgMar w:top="1440" w:right="1440" w:bottom="1440" w:left="1440" w:header="720" w:footer="720" w:gutter="0"/>
       <w:pgNumType w:start="1"/>
+      <w:cols w:space="720"/>
     </w:sectPr>
   </w:body>
 </w:document>
 </file>
 
-<file path=word/numbering.xml><?xml version="1.0" encoding="utf-8"?>
-<w:numbering xmlns:mc="http://schemas.openxmlformats.org/markup-compatibility/2006" xmlns:o="urn:schemas-microsoft-com:office:office" xmlns:r="http://schemas.openxmlformats.org/officeDocument/2006/relationships" xmlns:m="http://schemas.openxmlformats.org/officeDocument/2006/math" xmlns:v="urn:schemas-microsoft-com:vml" xmlns:wp="http://schemas.openxmlformats.org/drawingml/2006/wordprocessingDrawing" xmlns:w10="urn:schemas-microsoft-com:office:word" xmlns:w="http://schemas.openxmlformats.org/wordprocessingml/2006/main" xmlns:wne="http://schemas.microsoft.com/office/word/2006/wordml" xmlns:sl="http://schemas.openxmlformats.org/schemaLibrary/2006/main" xmlns:a="http://schemas.openxmlformats.org/drawingml/2006/main" xmlns:pic="http://schemas.openxmlformats.org/drawingml/2006/picture" xmlns:c="http://schemas.openxmlformats.org/drawingml/2006/chart" xmlns:lc="http://schemas.openxmlformats.org/drawingml/2006/lockedCanvas" xmlns:dgm="http://schemas.openxmlformats.org/drawingml/2006/diagram" xmlns:wps="http://schemas.microsoft.com/office/word/2010/wordprocessingShape" xmlns:wpg="http://schemas.microsoft.com/office/word/2010/wordprocessingGroup" xmlns:w14="http://schemas.microsoft.com/office/word/2010/wordml" xmlns:w15="http://schemas.microsoft.com/office/word/2012/wordml" xmlns:w16="http://schemas.microsoft.com/office/word/2018/wordml" xmlns:w16cex="http://schemas.microsoft.com/office/word/2018/wordml/cex" xmlns:w16cid="http://schemas.microsoft.com/office/word/2016/wordml/cid" xmlns="http://schemas.microsoft.com/office/tasks/2019/documenttasks" xmlns:cr="http://schemas.microsoft.com/office/comments/2020/reactions"/>
-</file>
-
 <file path=word/styles.xml><?xml version="1.0" encoding="utf-8"?>
-<w:styles xmlns:mc="http://schemas.openxmlformats.org/markup-compatibility/2006" xmlns:o="urn:schemas-microsoft-com:office:office" xmlns:r="http://schemas.openxmlformats.org/officeDocument/2006/relationships" xmlns:m="http://schemas.openxmlformats.org/officeDocument/2006/math" xmlns:v="urn:schemas-microsoft-com:vml" xmlns:wp="http://schemas.openxmlformats.org/drawingml/2006/wordprocessingDrawing" xmlns:w10="urn:schemas-microsoft-com:office:word" xmlns:w="http://schemas.openxmlformats.org/wordprocessingml/2006/main" xmlns:wne="http://schemas.microsoft.com/office/word/2006/wordml" xmlns:sl="http://schemas.openxmlformats.org/schemaLibrary/2006/main" xmlns:a="http://schemas.openxmlformats.org/drawingml/2006/main" xmlns:pic="http://schemas.openxmlformats.org/drawingml/2006/picture" xmlns:c="http://schemas.openxmlformats.org/drawingml/2006/chart" xmlns:lc="http://schemas.openxmlformats.org/drawingml/2006/lockedCanvas" xmlns:dgm="http://schemas.openxmlformats.org/drawingml/2006/diagram" xmlns:wps="http://schemas.microsoft.com/office/word/2010/wordprocessingShape" xmlns:wpg="http://schemas.microsoft.com/office/word/2010/wordprocessingGroup" xmlns:w14="http://schemas.microsoft.com/office/word/2010/wordml" xmlns:w15="http://schemas.microsoft.com/office/word/2012/wordml" xmlns:w16="http://schemas.microsoft.com/office/word/2018/wordml" xmlns:w16cex="http://schemas.microsoft.com/office/word/2018/wordml/cex" xmlns:w16cid="http://schemas.microsoft.com/office/word/2016/wordml/cid" xmlns="http://schemas.microsoft.com/office/tasks/2019/documenttasks" xmlns:cr="http://schemas.microsoft.com/office/comments/2020/reactions">
+<w:styles xmlns:mc="http://schemas.openxmlformats.org/markup-compatibility/2006" xmlns:r="http://schemas.openxmlformats.org/officeDocument/2006/relationships" xmlns:w="http://schemas.openxmlformats.org/wordprocessingml/2006/main" xmlns:w14="http://schemas.microsoft.com/office/word/2010/wordml" xmlns:w15="http://schemas.microsoft.com/office/word/2012/wordml" xmlns:w16cex="http://schemas.microsoft.com/office/word/2018/wordml/cex" xmlns:w16cid="http://schemas.microsoft.com/office/word/2016/wordml/cid" xmlns:w16="http://schemas.microsoft.com/office/word/2018/wordml" xmlns:w16du="http://schemas.microsoft.com/office/word/2023/wordml/word16du" xmlns:w16sdtdh="http://schemas.microsoft.com/office/word/2020/wordml/sdtdatahash" xmlns:w16se="http://schemas.microsoft.com/office/word/2015/wordml/symex" mc:Ignorable="w14 w15 w16se w16cid w16 w16cex w16sdtdh w16du">
   <w:docDefaults>
     <w:rPrDefault>
       <w:rPr>
-        <w:rFonts w:ascii="Arial" w:cs="Arial" w:eastAsia="Arial" w:hAnsi="Arial"/>
+        <w:rFonts w:ascii="Arial" w:eastAsia="Arial" w:hAnsi="Arial" w:cs="Arial"/>
         <w:sz w:val="22"/>
         <w:szCs w:val="22"/>
-        <w:lang w:val="en"/>
+        <w:lang w:val="en" w:eastAsia="en-US" w:bidi="ar-SA"/>
       </w:rPr>
     </w:rPrDefault>
     <w:pPrDefault>
@@ -95,21 +59,399 @@
       </w:pPr>
     </w:pPrDefault>
   </w:docDefaults>
-  <w:style w:type="paragraph" w:styleId="Normal" w:default="1">
-    <w:name w:val="normal"/>
-  </w:style>
-  <w:style w:type="table" w:styleId="TableNormal" w:default="1">
-    <w:name w:val="Table Normal"/>
+  <w:latentStyles w:defLockedState="0" w:defUIPriority="99" w:defSemiHidden="0" w:defUnhideWhenUsed="0" w:defQFormat="0" w:count="376">
+    <w:lsdException w:name="Normal" w:uiPriority="0" w:qFormat="1"/>
+    <w:lsdException w:name="heading 1" w:uiPriority="9" w:qFormat="1"/>
+    <w:lsdException w:name="heading 2" w:semiHidden="1" w:uiPriority="9" w:unhideWhenUsed="1" w:qFormat="1"/>
+    <w:lsdException w:name="heading 3" w:semiHidden="1" w:uiPriority="9" w:unhideWhenUsed="1" w:qFormat="1"/>
+    <w:lsdException w:name="heading 4" w:semiHidden="1" w:uiPriority="9" w:unhideWhenUsed="1" w:qFormat="1"/>
+    <w:lsdException w:name="heading 5" w:semiHidden="1" w:uiPriority="9" w:unhideWhenUsed="1" w:qFormat="1"/>
+    <w:lsdException w:name="heading 6" w:semiHidden="1" w:uiPriority="9" w:unhideWhenUsed="1" w:qFormat="1"/>
+    <w:lsdException w:name="heading 7" w:semiHidden="1" w:uiPriority="9" w:unhideWhenUsed="1" w:qFormat="1"/>
+    <w:lsdException w:name="heading 8" w:semiHidden="1" w:uiPriority="9" w:unhideWhenUsed="1" w:qFormat="1"/>
+    <w:lsdException w:name="heading 9" w:semiHidden="1" w:uiPriority="9" w:unhideWhenUsed="1" w:qFormat="1"/>
+    <w:lsdException w:name="index 1" w:semiHidden="1" w:unhideWhenUsed="1"/>
+    <w:lsdException w:name="index 2" w:semiHidden="1" w:unhideWhenUsed="1"/>
+    <w:lsdException w:name="index 3" w:semiHidden="1" w:unhideWhenUsed="1"/>
+    <w:lsdException w:name="index 4" w:semiHidden="1" w:unhideWhenUsed="1"/>
+    <w:lsdException w:name="index 5" w:semiHidden="1" w:unhideWhenUsed="1"/>
+    <w:lsdException w:name="index 6" w:semiHidden="1" w:unhideWhenUsed="1"/>
+    <w:lsdException w:name="index 7" w:semiHidden="1" w:unhideWhenUsed="1"/>
+    <w:lsdException w:name="index 8" w:semiHidden="1" w:unhideWhenUsed="1"/>
+    <w:lsdException w:name="index 9" w:semiHidden="1" w:unhideWhenUsed="1"/>
+    <w:lsdException w:name="toc 1" w:semiHidden="1" w:uiPriority="39" w:unhideWhenUsed="1"/>
+    <w:lsdException w:name="toc 2" w:semiHidden="1" w:uiPriority="39" w:unhideWhenUsed="1"/>
+    <w:lsdException w:name="toc 3" w:semiHidden="1" w:uiPriority="39" w:unhideWhenUsed="1"/>
+    <w:lsdException w:name="toc 4" w:semiHidden="1" w:uiPriority="39" w:unhideWhenUsed="1"/>
+    <w:lsdException w:name="toc 5" w:semiHidden="1" w:uiPriority="39" w:unhideWhenUsed="1"/>
+    <w:lsdException w:name="toc 6" w:semiHidden="1" w:uiPriority="39" w:unhideWhenUsed="1"/>
+    <w:lsdException w:name="toc 7" w:semiHidden="1" w:uiPriority="39" w:unhideWhenUsed="1"/>
+    <w:lsdException w:name="toc 8" w:semiHidden="1" w:uiPriority="39" w:unhideWhenUsed="1"/>
+    <w:lsdException w:name="toc 9" w:semiHidden="1" w:uiPriority="39" w:unhideWhenUsed="1"/>
+    <w:lsdException w:name="Normal Indent" w:semiHidden="1" w:unhideWhenUsed="1"/>
+    <w:lsdException w:name="footnote text" w:semiHidden="1" w:unhideWhenUsed="1"/>
+    <w:lsdException w:name="annotation text" w:semiHidden="1" w:unhideWhenUsed="1"/>
+    <w:lsdException w:name="header" w:semiHidden="1" w:unhideWhenUsed="1"/>
+    <w:lsdException w:name="footer" w:semiHidden="1" w:unhideWhenUsed="1"/>
+    <w:lsdException w:name="index heading" w:semiHidden="1" w:unhideWhenUsed="1"/>
+    <w:lsdException w:name="caption" w:semiHidden="1" w:uiPriority="35" w:unhideWhenUsed="1" w:qFormat="1"/>
+    <w:lsdException w:name="table of figures" w:semiHidden="1" w:unhideWhenUsed="1"/>
+    <w:lsdException w:name="envelope address" w:semiHidden="1" w:unhideWhenUsed="1"/>
+    <w:lsdException w:name="envelope return" w:semiHidden="1" w:unhideWhenUsed="1"/>
+    <w:lsdException w:name="footnote reference" w:semiHidden="1" w:unhideWhenUsed="1"/>
+    <w:lsdException w:name="annotation reference" w:semiHidden="1" w:unhideWhenUsed="1"/>
+    <w:lsdException w:name="line number" w:semiHidden="1" w:unhideWhenUsed="1"/>
+    <w:lsdException w:name="page number" w:semiHidden="1" w:unhideWhenUsed="1"/>
+    <w:lsdException w:name="endnote reference" w:semiHidden="1" w:unhideWhenUsed="1"/>
+    <w:lsdException w:name="endnote text" w:semiHidden="1" w:unhideWhenUsed="1"/>
+    <w:lsdException w:name="table of authorities" w:semiHidden="1" w:unhideWhenUsed="1"/>
+    <w:lsdException w:name="macro" w:semiHidden="1" w:unhideWhenUsed="1"/>
+    <w:lsdException w:name="toa heading" w:semiHidden="1" w:unhideWhenUsed="1"/>
+    <w:lsdException w:name="List" w:semiHidden="1" w:unhideWhenUsed="1"/>
+    <w:lsdException w:name="List Bullet" w:semiHidden="1" w:unhideWhenUsed="1"/>
+    <w:lsdException w:name="List Number" w:semiHidden="1" w:unhideWhenUsed="1"/>
+    <w:lsdException w:name="List 2" w:semiHidden="1" w:unhideWhenUsed="1"/>
+    <w:lsdException w:name="List 3" w:semiHidden="1" w:unhideWhenUsed="1"/>
+    <w:lsdException w:name="List 4" w:semiHidden="1" w:unhideWhenUsed="1"/>
+    <w:lsdException w:name="List 5" w:semiHidden="1" w:unhideWhenUsed="1"/>
+    <w:lsdException w:name="List Bullet 2" w:semiHidden="1" w:unhideWhenUsed="1"/>
+    <w:lsdException w:name="List Bullet 3" w:semiHidden="1" w:unhideWhenUsed="1"/>
+    <w:lsdException w:name="List Bullet 4" w:semiHidden="1" w:unhideWhenUsed="1"/>
+    <w:lsdException w:name="List Bullet 5" w:semiHidden="1" w:unhideWhenUsed="1"/>
+    <w:lsdException w:name="List Number 2" w:semiHidden="1" w:unhideWhenUsed="1"/>
+    <w:lsdException w:name="List Number 3" w:semiHidden="1" w:unhideWhenUsed="1"/>
+    <w:lsdException w:name="List Number 4" w:semiHidden="1" w:unhideWhenUsed="1"/>
+    <w:lsdException w:name="List Number 5" w:semiHidden="1" w:unhideWhenUsed="1"/>
+    <w:lsdException w:name="Title" w:uiPriority="10" w:qFormat="1"/>
+    <w:lsdException w:name="Closing" w:semiHidden="1" w:unhideWhenUsed="1"/>
+    <w:lsdException w:name="Signature" w:semiHidden="1" w:unhideWhenUsed="1"/>
+    <w:lsdException w:name="Default Paragraph Font" w:semiHidden="1" w:uiPriority="1" w:unhideWhenUsed="1"/>
+    <w:lsdException w:name="Body Text" w:semiHidden="1" w:unhideWhenUsed="1"/>
+    <w:lsdException w:name="Body Text Indent" w:semiHidden="1" w:unhideWhenUsed="1"/>
+    <w:lsdException w:name="List Continue" w:semiHidden="1" w:unhideWhenUsed="1"/>
+    <w:lsdException w:name="List Continue 2" w:semiHidden="1" w:unhideWhenUsed="1"/>
+    <w:lsdException w:name="List Continue 3" w:semiHidden="1" w:unhideWhenUsed="1"/>
+    <w:lsdException w:name="List Continue 4" w:semiHidden="1" w:unhideWhenUsed="1"/>
+    <w:lsdException w:name="List Continue 5" w:semiHidden="1" w:unhideWhenUsed="1"/>
+    <w:lsdException w:name="Message Header" w:semiHidden="1" w:unhideWhenUsed="1"/>
+    <w:lsdException w:name="Subtitle" w:uiPriority="11" w:qFormat="1"/>
+    <w:lsdException w:name="Salutation" w:semiHidden="1" w:unhideWhenUsed="1"/>
+    <w:lsdException w:name="Date" w:semiHidden="1" w:unhideWhenUsed="1"/>
+    <w:lsdException w:name="Body Text First Indent" w:semiHidden="1" w:unhideWhenUsed="1"/>
+    <w:lsdException w:name="Body Text First Indent 2" w:semiHidden="1" w:unhideWhenUsed="1"/>
+    <w:lsdException w:name="Note Heading" w:semiHidden="1" w:unhideWhenUsed="1"/>
+    <w:lsdException w:name="Body Text 2" w:semiHidden="1" w:unhideWhenUsed="1"/>
+    <w:lsdException w:name="Body Text 3" w:semiHidden="1" w:unhideWhenUsed="1"/>
+    <w:lsdException w:name="Body Text Indent 2" w:semiHidden="1" w:unhideWhenUsed="1"/>
+    <w:lsdException w:name="Body Text Indent 3" w:semiHidden="1" w:unhideWhenUsed="1"/>
+    <w:lsdException w:name="Block Text" w:semiHidden="1" w:unhideWhenUsed="1"/>
+    <w:lsdException w:name="Hyperlink" w:semiHidden="1" w:unhideWhenUsed="1"/>
+    <w:lsdException w:name="FollowedHyperlink" w:semiHidden="1" w:unhideWhenUsed="1"/>
+    <w:lsdException w:name="Strong" w:uiPriority="22" w:qFormat="1"/>
+    <w:lsdException w:name="Emphasis" w:uiPriority="20" w:qFormat="1"/>
+    <w:lsdException w:name="Document Map" w:semiHidden="1" w:unhideWhenUsed="1"/>
+    <w:lsdException w:name="Plain Text" w:semiHidden="1" w:unhideWhenUsed="1"/>
+    <w:lsdException w:name="E-mail Signature" w:semiHidden="1" w:unhideWhenUsed="1"/>
+    <w:lsdException w:name="HTML Top of Form" w:semiHidden="1" w:unhideWhenUsed="1"/>
+    <w:lsdException w:name="HTML Bottom of Form" w:semiHidden="1" w:unhideWhenUsed="1"/>
+    <w:lsdException w:name="Normal (Web)" w:semiHidden="1" w:unhideWhenUsed="1"/>
+    <w:lsdException w:name="HTML Acronym" w:semiHidden="1" w:unhideWhenUsed="1"/>
+    <w:lsdException w:name="HTML Address" w:semiHidden="1" w:unhideWhenUsed="1"/>
+    <w:lsdException w:name="HTML Cite" w:semiHidden="1" w:unhideWhenUsed="1"/>
+    <w:lsdException w:name="HTML Code" w:semiHidden="1" w:unhideWhenUsed="1"/>
+    <w:lsdException w:name="HTML Definition" w:semiHidden="1" w:unhideWhenUsed="1"/>
+    <w:lsdException w:name="HTML Keyboard" w:semiHidden="1" w:unhideWhenUsed="1"/>
+    <w:lsdException w:name="HTML Preformatted" w:semiHidden="1" w:unhideWhenUsed="1"/>
+    <w:lsdException w:name="HTML Sample" w:semiHidden="1" w:unhideWhenUsed="1"/>
+    <w:lsdException w:name="HTML Typewriter" w:semiHidden="1" w:unhideWhenUsed="1"/>
+    <w:lsdException w:name="HTML Variable" w:semiHidden="1" w:unhideWhenUsed="1"/>
+    <w:lsdException w:name="Normal Table" w:semiHidden="1" w:unhideWhenUsed="1"/>
+    <w:lsdException w:name="annotation subject" w:semiHidden="1" w:unhideWhenUsed="1"/>
+    <w:lsdException w:name="No List" w:semiHidden="1" w:unhideWhenUsed="1"/>
+    <w:lsdException w:name="Outline List 1" w:semiHidden="1" w:unhideWhenUsed="1"/>
+    <w:lsdException w:name="Outline List 2" w:semiHidden="1" w:unhideWhenUsed="1"/>
+    <w:lsdException w:name="Outline List 3" w:semiHidden="1" w:unhideWhenUsed="1"/>
+    <w:lsdException w:name="Table Simple 1" w:semiHidden="1" w:unhideWhenUsed="1"/>
+    <w:lsdException w:name="Table Simple 2" w:semiHidden="1" w:unhideWhenUsed="1"/>
+    <w:lsdException w:name="Table Simple 3" w:semiHidden="1" w:unhideWhenUsed="1"/>
+    <w:lsdException w:name="Table Classic 1" w:semiHidden="1" w:unhideWhenUsed="1"/>
+    <w:lsdException w:name="Table Classic 2" w:semiHidden="1" w:unhideWhenUsed="1"/>
+    <w:lsdException w:name="Table Classic 3" w:semiHidden="1" w:unhideWhenUsed="1"/>
+    <w:lsdException w:name="Table Classic 4" w:semiHidden="1" w:unhideWhenUsed="1"/>
+    <w:lsdException w:name="Table Colorful 1" w:semiHidden="1" w:unhideWhenUsed="1"/>
+    <w:lsdException w:name="Table Colorful 2" w:semiHidden="1" w:unhideWhenUsed="1"/>
+    <w:lsdException w:name="Table Colorful 3" w:semiHidden="1" w:unhideWhenUsed="1"/>
+    <w:lsdException w:name="Table Columns 1" w:semiHidden="1" w:unhideWhenUsed="1"/>
+    <w:lsdException w:name="Table Columns 2" w:semiHidden="1" w:unhideWhenUsed="1"/>
+    <w:lsdException w:name="Table Columns 3" w:semiHidden="1" w:unhideWhenUsed="1"/>
+    <w:lsdException w:name="Table Columns 4" w:semiHidden="1" w:unhideWhenUsed="1"/>
+    <w:lsdException w:name="Table Columns 5" w:semiHidden="1" w:unhideWhenUsed="1"/>
+    <w:lsdException w:name="Table Grid 1" w:semiHidden="1" w:unhideWhenUsed="1"/>
+    <w:lsdException w:name="Table Grid 2" w:semiHidden="1" w:unhideWhenUsed="1"/>
+    <w:lsdException w:name="Table Grid 3" w:semiHidden="1" w:unhideWhenUsed="1"/>
+    <w:lsdException w:name="Table Grid 4" w:semiHidden="1" w:unhideWhenUsed="1"/>
+    <w:lsdException w:name="Table Grid 5" w:semiHidden="1" w:unhideWhenUsed="1"/>
+    <w:lsdException w:name="Table Grid 6" w:semiHidden="1" w:unhideWhenUsed="1"/>
+    <w:lsdException w:name="Table Grid 7" w:semiHidden="1" w:unhideWhenUsed="1"/>
+    <w:lsdException w:name="Table Grid 8" w:semiHidden="1" w:unhideWhenUsed="1"/>
+    <w:lsdException w:name="Table List 1" w:semiHidden="1" w:unhideWhenUsed="1"/>
+    <w:lsdException w:name="Table List 2" w:semiHidden="1" w:unhideWhenUsed="1"/>
+    <w:lsdException w:name="Table List 3" w:semiHidden="1" w:unhideWhenUsed="1"/>
+    <w:lsdException w:name="Table List 4" w:semiHidden="1" w:unhideWhenUsed="1"/>
+    <w:lsdException w:name="Table List 5" w:semiHidden="1" w:unhideWhenUsed="1"/>
+    <w:lsdException w:name="Table List 6" w:semiHidden="1" w:unhideWhenUsed="1"/>
+    <w:lsdException w:name="Table List 7" w:semiHidden="1" w:unhideWhenUsed="1"/>
+    <w:lsdException w:name="Table List 8" w:semiHidden="1" w:unhideWhenUsed="1"/>
+    <w:lsdException w:name="Table 3D effects 1" w:semiHidden="1" w:unhideWhenUsed="1"/>
+    <w:lsdException w:name="Table 3D effects 2" w:semiHidden="1" w:unhideWhenUsed="1"/>
+    <w:lsdException w:name="Table 3D effects 3" w:semiHidden="1" w:unhideWhenUsed="1"/>
+    <w:lsdException w:name="Table Contemporary" w:semiHidden="1" w:unhideWhenUsed="1"/>
+    <w:lsdException w:name="Table Elegant" w:semiHidden="1" w:unhideWhenUsed="1"/>
+    <w:lsdException w:name="Table Professional" w:semiHidden="1" w:unhideWhenUsed="1"/>
+    <w:lsdException w:name="Table Subtle 1" w:semiHidden="1" w:unhideWhenUsed="1"/>
+    <w:lsdException w:name="Table Subtle 2" w:semiHidden="1" w:unhideWhenUsed="1"/>
+    <w:lsdException w:name="Table Web 1" w:semiHidden="1" w:unhideWhenUsed="1"/>
+    <w:lsdException w:name="Table Web 2" w:semiHidden="1" w:unhideWhenUsed="1"/>
+    <w:lsdException w:name="Table Web 3" w:semiHidden="1" w:unhideWhenUsed="1"/>
+    <w:lsdException w:name="Balloon Text" w:semiHidden="1" w:unhideWhenUsed="1"/>
+    <w:lsdException w:name="Table Grid" w:uiPriority="39"/>
+    <w:lsdException w:name="Table Theme" w:semiHidden="1" w:unhideWhenUsed="1"/>
+    <w:lsdException w:name="Placeholder Text" w:semiHidden="1"/>
+    <w:lsdException w:name="No Spacing" w:uiPriority="1" w:qFormat="1"/>
+    <w:lsdException w:name="Light Shading" w:uiPriority="60"/>
+    <w:lsdException w:name="Light List" w:uiPriority="61"/>
+    <w:lsdException w:name="Light Grid" w:uiPriority="62"/>
+    <w:lsdException w:name="Medium Shading 1" w:uiPriority="63"/>
+    <w:lsdException w:name="Medium Shading 2" w:uiPriority="64"/>
+    <w:lsdException w:name="Medium List 1" w:uiPriority="65"/>
+    <w:lsdException w:name="Medium List 2" w:uiPriority="66"/>
+    <w:lsdException w:name="Medium Grid 1" w:uiPriority="67"/>
+    <w:lsdException w:name="Medium Grid 2" w:uiPriority="68"/>
+    <w:lsdException w:name="Medium Grid 3" w:uiPriority="69"/>
+    <w:lsdException w:name="Dark List" w:uiPriority="70"/>
+    <w:lsdException w:name="Colorful Shading" w:uiPriority="71"/>
+    <w:lsdException w:name="Colorful List" w:uiPriority="72"/>
+    <w:lsdException w:name="Colorful Grid" w:uiPriority="73"/>
+    <w:lsdException w:name="Light Shading Accent 1" w:uiPriority="60"/>
+    <w:lsdException w:name="Light List Accent 1" w:uiPriority="61"/>
+    <w:lsdException w:name="Light Grid Accent 1" w:uiPriority="62"/>
+    <w:lsdException w:name="Medium Shading 1 Accent 1" w:uiPriority="63"/>
+    <w:lsdException w:name="Medium Shading 2 Accent 1" w:uiPriority="64"/>
+    <w:lsdException w:name="Medium List 1 Accent 1" w:uiPriority="65"/>
+    <w:lsdException w:name="Revision" w:semiHidden="1"/>
+    <w:lsdException w:name="List Paragraph" w:uiPriority="34" w:qFormat="1"/>
+    <w:lsdException w:name="Quote" w:uiPriority="29" w:qFormat="1"/>
+    <w:lsdException w:name="Intense Quote" w:uiPriority="30" w:qFormat="1"/>
+    <w:lsdException w:name="Medium List 2 Accent 1" w:uiPriority="66"/>
+    <w:lsdException w:name="Medium Grid 1 Accent 1" w:uiPriority="67"/>
+    <w:lsdException w:name="Medium Grid 2 Accent 1" w:uiPriority="68"/>
+    <w:lsdException w:name="Medium Grid 3 Accent 1" w:uiPriority="69"/>
+    <w:lsdException w:name="Dark List Accent 1" w:uiPriority="70"/>
+    <w:lsdException w:name="Colorful Shading Accent 1" w:uiPriority="71"/>
+    <w:lsdException w:name="Colorful List Accent 1" w:uiPriority="72"/>
+    <w:lsdException w:name="Colorful Grid Accent 1" w:uiPriority="73"/>
+    <w:lsdException w:name="Light Shading Accent 2" w:uiPriority="60"/>
+    <w:lsdException w:name="Light List Accent 2" w:uiPriority="61"/>
+    <w:lsdException w:name="Light Grid Accent 2" w:uiPriority="62"/>
+    <w:lsdException w:name="Medium Shading 1 Accent 2" w:uiPriority="63"/>
+    <w:lsdException w:name="Medium Shading 2 Accent 2" w:uiPriority="64"/>
+    <w:lsdException w:name="Medium List 1 Accent 2" w:uiPriority="65"/>
+    <w:lsdException w:name="Medium List 2 Accent 2" w:uiPriority="66"/>
+    <w:lsdException w:name="Medium Grid 1 Accent 2" w:uiPriority="67"/>
+    <w:lsdException w:name="Medium Grid 2 Accent 2" w:uiPriority="68"/>
+    <w:lsdException w:name="Medium Grid 3 Accent 2" w:uiPriority="69"/>
+    <w:lsdException w:name="Dark List Accent 2" w:uiPriority="70"/>
+    <w:lsdException w:name="Colorful Shading Accent 2" w:uiPriority="71"/>
+    <w:lsdException w:name="Colorful List Accent 2" w:uiPriority="72"/>
+    <w:lsdException w:name="Colorful Grid Accent 2" w:uiPriority="73"/>
+    <w:lsdException w:name="Light Shading Accent 3" w:uiPriority="60"/>
+    <w:lsdException w:name="Light List Accent 3" w:uiPriority="61"/>
+    <w:lsdException w:name="Light Grid Accent 3" w:uiPriority="62"/>
+    <w:lsdException w:name="Medium Shading 1 Accent 3" w:uiPriority="63"/>
+    <w:lsdException w:name="Medium Shading 2 Accent 3" w:uiPriority="64"/>
+    <w:lsdException w:name="Medium List 1 Accent 3" w:uiPriority="65"/>
+    <w:lsdException w:name="Medium List 2 Accent 3" w:uiPriority="66"/>
+    <w:lsdException w:name="Medium Grid 1 Accent 3" w:uiPriority="67"/>
+    <w:lsdException w:name="Medium Grid 2 Accent 3" w:uiPriority="68"/>
+    <w:lsdException w:name="Medium Grid 3 Accent 3" w:uiPriority="69"/>
+    <w:lsdException w:name="Dark List Accent 3" w:uiPriority="70"/>
+    <w:lsdException w:name="Colorful Shading Accent 3" w:uiPriority="71"/>
+    <w:lsdException w:name="Colorful List Accent 3" w:uiPriority="72"/>
+    <w:lsdException w:name="Colorful Grid Accent 3" w:uiPriority="73"/>
+    <w:lsdException w:name="Light Shading Accent 4" w:uiPriority="60"/>
+    <w:lsdException w:name="Light List Accent 4" w:uiPriority="61"/>
+    <w:lsdException w:name="Light Grid Accent 4" w:uiPriority="62"/>
+    <w:lsdException w:name="Medium Shading 1 Accent 4" w:uiPriority="63"/>
+    <w:lsdException w:name="Medium Shading 2 Accent 4" w:uiPriority="64"/>
+    <w:lsdException w:name="Medium List 1 Accent 4" w:uiPriority="65"/>
+    <w:lsdException w:name="Medium List 2 Accent 4" w:uiPriority="66"/>
+    <w:lsdException w:name="Medium Grid 1 Accent 4" w:uiPriority="67"/>
+    <w:lsdException w:name="Medium Grid 2 Accent 4" w:uiPriority="68"/>
+    <w:lsdException w:name="Medium Grid 3 Accent 4" w:uiPriority="69"/>
+    <w:lsdException w:name="Dark List Accent 4" w:uiPriority="70"/>
+    <w:lsdException w:name="Colorful Shading Accent 4" w:uiPriority="71"/>
+    <w:lsdException w:name="Colorful List Accent 4" w:uiPriority="72"/>
+    <w:lsdException w:name="Colorful Grid Accent 4" w:uiPriority="73"/>
+    <w:lsdException w:name="Light Shading Accent 5" w:uiPriority="60"/>
+    <w:lsdException w:name="Light List Accent 5" w:uiPriority="61"/>
+    <w:lsdException w:name="Light Grid Accent 5" w:uiPriority="62"/>
+    <w:lsdException w:name="Medium Shading 1 Accent 5" w:uiPriority="63"/>
+    <w:lsdException w:name="Medium Shading 2 Accent 5" w:uiPriority="64"/>
+    <w:lsdException w:name="Medium List 1 Accent 5" w:uiPriority="65"/>
+    <w:lsdException w:name="Medium List 2 Accent 5" w:uiPriority="66"/>
+    <w:lsdException w:name="Medium Grid 1 Accent 5" w:uiPriority="67"/>
+    <w:lsdException w:name="Medium Grid 2 Accent 5" w:uiPriority="68"/>
+    <w:lsdException w:name="Medium Grid 3 Accent 5" w:uiPriority="69"/>
+    <w:lsdException w:name="Dark List Accent 5" w:uiPriority="70"/>
+    <w:lsdException w:name="Colorful Shading Accent 5" w:uiPriority="71"/>
+    <w:lsdException w:name="Colorful List Accent 5" w:uiPriority="72"/>
+    <w:lsdException w:name="Colorful Grid Accent 5" w:uiPriority="73"/>
+    <w:lsdException w:name="Light Shading Accent 6" w:uiPriority="60"/>
+    <w:lsdException w:name="Light List Accent 6" w:uiPriority="61"/>
+    <w:lsdException w:name="Light Grid Accent 6" w:uiPriority="62"/>
+    <w:lsdException w:name="Medium Shading 1 Accent 6" w:uiPriority="63"/>
+    <w:lsdException w:name="Medium Shading 2 Accent 6" w:uiPriority="64"/>
+    <w:lsdException w:name="Medium List 1 Accent 6" w:uiPriority="65"/>
+    <w:lsdException w:name="Medium List 2 Accent 6" w:uiPriority="66"/>
+    <w:lsdException w:name="Medium Grid 1 Accent 6" w:uiPriority="67"/>
+    <w:lsdException w:name="Medium Grid 2 Accent 6" w:uiPriority="68"/>
+    <w:lsdException w:name="Medium Grid 3 Accent 6" w:uiPriority="69"/>
+    <w:lsdException w:name="Dark List Accent 6" w:uiPriority="70"/>
+    <w:lsdException w:name="Colorful Shading Accent 6" w:uiPriority="71"/>
+    <w:lsdException w:name="Colorful List Accent 6" w:uiPriority="72"/>
+    <w:lsdException w:name="Colorful Grid Accent 6" w:uiPriority="73"/>
+    <w:lsdException w:name="Subtle Emphasis" w:uiPriority="19" w:qFormat="1"/>
+    <w:lsdException w:name="Intense Emphasis" w:uiPriority="21" w:qFormat="1"/>
+    <w:lsdException w:name="Subtle Reference" w:uiPriority="31" w:qFormat="1"/>
+    <w:lsdException w:name="Intense Reference" w:uiPriority="32" w:qFormat="1"/>
+    <w:lsdException w:name="Book Title" w:uiPriority="33" w:qFormat="1"/>
+    <w:lsdException w:name="Bibliography" w:semiHidden="1" w:uiPriority="37" w:unhideWhenUsed="1"/>
+    <w:lsdException w:name="TOC Heading" w:semiHidden="1" w:uiPriority="39" w:unhideWhenUsed="1" w:qFormat="1"/>
+    <w:lsdException w:name="Plain Table 1" w:uiPriority="41"/>
+    <w:lsdException w:name="Plain Table 2" w:uiPriority="42"/>
+    <w:lsdException w:name="Plain Table 3" w:uiPriority="43"/>
+    <w:lsdException w:name="Plain Table 4" w:uiPriority="44"/>
+    <w:lsdException w:name="Plain Table 5" w:uiPriority="45"/>
+    <w:lsdException w:name="Grid Table Light" w:uiPriority="40"/>
+    <w:lsdException w:name="Grid Table 1 Light" w:uiPriority="46"/>
+    <w:lsdException w:name="Grid Table 2" w:uiPriority="47"/>
+    <w:lsdException w:name="Grid Table 3" w:uiPriority="48"/>
+    <w:lsdException w:name="Grid Table 4" w:uiPriority="49"/>
+    <w:lsdException w:name="Grid Table 5 Dark" w:uiPriority="50"/>
+    <w:lsdException w:name="Grid Table 6 Colorful" w:uiPriority="51"/>
+    <w:lsdException w:name="Grid Table 7 Colorful" w:uiPriority="52"/>
+    <w:lsdException w:name="Grid Table 1 Light Accent 1" w:uiPriority="46"/>
+    <w:lsdException w:name="Grid Table 2 Accent 1" w:uiPriority="47"/>
+    <w:lsdException w:name="Grid Table 3 Accent 1" w:uiPriority="48"/>
+    <w:lsdException w:name="Grid Table 4 Accent 1" w:uiPriority="49"/>
+    <w:lsdException w:name="Grid Table 5 Dark Accent 1" w:uiPriority="50"/>
+    <w:lsdException w:name="Grid Table 6 Colorful Accent 1" w:uiPriority="51"/>
+    <w:lsdException w:name="Grid Table 7 Colorful Accent 1" w:uiPriority="52"/>
+    <w:lsdException w:name="Grid Table 1 Light Accent 2" w:uiPriority="46"/>
+    <w:lsdException w:name="Grid Table 2 Accent 2" w:uiPriority="47"/>
+    <w:lsdException w:name="Grid Table 3 Accent 2" w:uiPriority="48"/>
+    <w:lsdException w:name="Grid Table 4 Accent 2" w:uiPriority="49"/>
+    <w:lsdException w:name="Grid Table 5 Dark Accent 2" w:uiPriority="50"/>
+    <w:lsdException w:name="Grid Table 6 Colorful Accent 2" w:uiPriority="51"/>
+    <w:lsdException w:name="Grid Table 7 Colorful Accent 2" w:uiPriority="52"/>
+    <w:lsdException w:name="Grid Table 1 Light Accent 3" w:uiPriority="46"/>
+    <w:lsdException w:name="Grid Table 2 Accent 3" w:uiPriority="47"/>
+    <w:lsdException w:name="Grid Table 3 Accent 3" w:uiPriority="48"/>
+    <w:lsdException w:name="Grid Table 4 Accent 3" w:uiPriority="49"/>
+    <w:lsdException w:name="Grid Table 5 Dark Accent 3" w:uiPriority="50"/>
+    <w:lsdException w:name="Grid Table 6 Colorful Accent 3" w:uiPriority="51"/>
+    <w:lsdException w:name="Grid Table 7 Colorful Accent 3" w:uiPriority="52"/>
+    <w:lsdException w:name="Grid Table 1 Light Accent 4" w:uiPriority="46"/>
+    <w:lsdException w:name="Grid Table 2 Accent 4" w:uiPriority="47"/>
+    <w:lsdException w:name="Grid Table 3 Accent 4" w:uiPriority="48"/>
+    <w:lsdException w:name="Grid Table 4 Accent 4" w:uiPriority="49"/>
+    <w:lsdException w:name="Grid Table 5 Dark Accent 4" w:uiPriority="50"/>
+    <w:lsdException w:name="Grid Table 6 Colorful Accent 4" w:uiPriority="51"/>
+    <w:lsdException w:name="Grid Table 7 Colorful Accent 4" w:uiPriority="52"/>
+    <w:lsdException w:name="Grid Table 1 Light Accent 5" w:uiPriority="46"/>
+    <w:lsdException w:name="Grid Table 2 Accent 5" w:uiPriority="47"/>
+    <w:lsdException w:name="Grid Table 3 Accent 5" w:uiPriority="48"/>
+    <w:lsdException w:name="Grid Table 4 Accent 5" w:uiPriority="49"/>
+    <w:lsdException w:name="Grid Table 5 Dark Accent 5" w:uiPriority="50"/>
+    <w:lsdException w:name="Grid Table 6 Colorful Accent 5" w:uiPriority="51"/>
+    <w:lsdException w:name="Grid Table 7 Colorful Accent 5" w:uiPriority="52"/>
+    <w:lsdException w:name="Grid Table 1 Light Accent 6" w:uiPriority="46"/>
+    <w:lsdException w:name="Grid Table 2 Accent 6" w:uiPriority="47"/>
+    <w:lsdException w:name="Grid Table 3 Accent 6" w:uiPriority="48"/>
+    <w:lsdException w:name="Grid Table 4 Accent 6" w:uiPriority="49"/>
+    <w:lsdException w:name="Grid Table 5 Dark Accent 6" w:uiPriority="50"/>
+    <w:lsdException w:name="Grid Table 6 Colorful Accent 6" w:uiPriority="51"/>
+    <w:lsdException w:name="Grid Table 7 Colorful Accent 6" w:uiPriority="52"/>
+    <w:lsdException w:name="List Table 1 Light" w:uiPriority="46"/>
+    <w:lsdException w:name="List Table 2" w:uiPriority="47"/>
+    <w:lsdException w:name="List Table 3" w:uiPriority="48"/>
+    <w:lsdException w:name="List Table 4" w:uiPriority="49"/>
+    <w:lsdException w:name="List Table 5 Dark" w:uiPriority="50"/>
+    <w:lsdException w:name="List Table 6 Colorful" w:uiPriority="51"/>
+    <w:lsdException w:name="List Table 7 Colorful" w:uiPriority="52"/>
+    <w:lsdException w:name="List Table 1 Light Accent 1" w:uiPriority="46"/>
+    <w:lsdException w:name="List Table 2 Accent 1" w:uiPriority="47"/>
+    <w:lsdException w:name="List Table 3 Accent 1" w:uiPriority="48"/>
+    <w:lsdException w:name="List Table 4 Accent 1" w:uiPriority="49"/>
+    <w:lsdException w:name="List Table 5 Dark Accent 1" w:uiPriority="50"/>
+    <w:lsdException w:name="List Table 6 Colorful Accent 1" w:uiPriority="51"/>
+    <w:lsdException w:name="List Table 7 Colorful Accent 1" w:uiPriority="52"/>
+    <w:lsdException w:name="List Table 1 Light Accent 2" w:uiPriority="46"/>
+    <w:lsdException w:name="List Table 2 Accent 2" w:uiPriority="47"/>
+    <w:lsdException w:name="List Table 3 Accent 2" w:uiPriority="48"/>
+    <w:lsdException w:name="List Table 4 Accent 2" w:uiPriority="49"/>
+    <w:lsdException w:name="List Table 5 Dark Accent 2" w:uiPriority="50"/>
+    <w:lsdException w:name="List Table 6 Colorful Accent 2" w:uiPriority="51"/>
+    <w:lsdException w:name="List Table 7 Colorful Accent 2" w:uiPriority="52"/>
+    <w:lsdException w:name="List Table 1 Light Accent 3" w:uiPriority="46"/>
+    <w:lsdException w:name="List Table 2 Accent 3" w:uiPriority="47"/>
+    <w:lsdException w:name="List Table 3 Accent 3" w:uiPriority="48"/>
+    <w:lsdException w:name="List Table 4 Accent 3" w:uiPriority="49"/>
+    <w:lsdException w:name="List Table 5 Dark Accent 3" w:uiPriority="50"/>
+    <w:lsdException w:name="List Table 6 Colorful Accent 3" w:uiPriority="51"/>
+    <w:lsdException w:name="List Table 7 Colorful Accent 3" w:uiPriority="52"/>
+    <w:lsdException w:name="List Table 1 Light Accent 4" w:uiPriority="46"/>
+    <w:lsdException w:name="List Table 2 Accent 4" w:uiPriority="47"/>
+    <w:lsdException w:name="List Table 3 Accent 4" w:uiPriority="48"/>
+    <w:lsdException w:name="List Table 4 Accent 4" w:uiPriority="49"/>
+    <w:lsdException w:name="List Table 5 Dark Accent 4" w:uiPriority="50"/>
+    <w:lsdException w:name="List Table 6 Colorful Accent 4" w:uiPriority="51"/>
+    <w:lsdException w:name="List Table 7 Colorful Accent 4" w:uiPriority="52"/>
+    <w:lsdException w:name="List Table 1 Light Accent 5" w:uiPriority="46"/>
+    <w:lsdException w:name="List Table 2 Accent 5" w:uiPriority="47"/>
+    <w:lsdException w:name="List Table 3 Accent 5" w:uiPriority="48"/>
+    <w:lsdException w:name="List Table 4 Accent 5" w:uiPriority="49"/>
+    <w:lsdException w:name="List Table 5 Dark Accent 5" w:uiPriority="50"/>
+    <w:lsdException w:name="List Table 6 Colorful Accent 5" w:uiPriority="51"/>
+    <w:lsdException w:name="List Table 7 Colorful Accent 5" w:uiPriority="52"/>
+    <w:lsdException w:name="List Table 1 Light Accent 6" w:uiPriority="46"/>
+    <w:lsdException w:name="List Table 2 Accent 6" w:uiPriority="47"/>
+    <w:lsdException w:name="List Table 3 Accent 6" w:uiPriority="48"/>
+    <w:lsdException w:name="List Table 4 Accent 6" w:uiPriority="49"/>
+    <w:lsdException w:name="List Table 5 Dark Accent 6" w:uiPriority="50"/>
+    <w:lsdException w:name="List Table 6 Colorful Accent 6" w:uiPriority="51"/>
+    <w:lsdException w:name="List Table 7 Colorful Accent 6" w:uiPriority="52"/>
+    <w:lsdException w:name="Mention" w:semiHidden="1" w:unhideWhenUsed="1"/>
+    <w:lsdException w:name="Smart Hyperlink" w:semiHidden="1" w:unhideWhenUsed="1"/>
+    <w:lsdException w:name="Hashtag" w:semiHidden="1" w:unhideWhenUsed="1"/>
+    <w:lsdException w:name="Unresolved Mention" w:semiHidden="1" w:unhideWhenUsed="1"/>
+    <w:lsdException w:name="Smart Link" w:semiHidden="1" w:unhideWhenUsed="1"/>
+  </w:latentStyles>
+  <w:style w:type="paragraph" w:default="1" w:styleId="Normal">
+    <w:name w:val="Normal"/>
+    <w:qFormat/>
   </w:style>
   <w:style w:type="paragraph" w:styleId="Heading1">
     <w:name w:val="heading 1"/>
     <w:basedOn w:val="Normal"/>
     <w:next w:val="Normal"/>
+    <w:uiPriority w:val="9"/>
+    <w:qFormat/>
     <w:pPr>
-      <w:keepNext w:val="1"/>
-      <w:keepLines w:val="1"/>
-      <w:pageBreakBefore w:val="0"/>
-      <w:spacing w:after="120" w:before="400" w:lineRule="auto"/>
+      <w:keepNext/>
+      <w:keepLines/>
+      <w:spacing w:before="400" w:after="120"/>
+      <w:outlineLvl w:val="0"/>
     </w:pPr>
     <w:rPr>
       <w:sz w:val="40"/>
@@ -120,14 +462,17 @@
     <w:name w:val="heading 2"/>
     <w:basedOn w:val="Normal"/>
     <w:next w:val="Normal"/>
+    <w:uiPriority w:val="9"/>
+    <w:semiHidden/>
+    <w:unhideWhenUsed/>
+    <w:qFormat/>
     <w:pPr>
-      <w:keepNext w:val="1"/>
-      <w:keepLines w:val="1"/>
-      <w:pageBreakBefore w:val="0"/>
-      <w:spacing w:after="120" w:before="360" w:lineRule="auto"/>
+      <w:keepNext/>
+      <w:keepLines/>
+      <w:spacing w:before="360" w:after="120"/>
+      <w:outlineLvl w:val="1"/>
     </w:pPr>
     <w:rPr>
-      <w:b w:val="0"/>
       <w:sz w:val="32"/>
       <w:szCs w:val="32"/>
     </w:rPr>
@@ -136,14 +481,17 @@
     <w:name w:val="heading 3"/>
     <w:basedOn w:val="Normal"/>
     <w:next w:val="Normal"/>
+    <w:uiPriority w:val="9"/>
+    <w:semiHidden/>
+    <w:unhideWhenUsed/>
+    <w:qFormat/>
     <w:pPr>
-      <w:keepNext w:val="1"/>
-      <w:keepLines w:val="1"/>
-      <w:pageBreakBefore w:val="0"/>
-      <w:spacing w:after="80" w:before="320" w:lineRule="auto"/>
+      <w:keepNext/>
+      <w:keepLines/>
+      <w:spacing w:before="320" w:after="80"/>
+      <w:outlineLvl w:val="2"/>
     </w:pPr>
     <w:rPr>
-      <w:b w:val="0"/>
       <w:color w:val="434343"/>
       <w:sz w:val="28"/>
       <w:szCs w:val="28"/>
@@ -153,11 +501,15 @@
     <w:name w:val="heading 4"/>
     <w:basedOn w:val="Normal"/>
     <w:next w:val="Normal"/>
+    <w:uiPriority w:val="9"/>
+    <w:semiHidden/>
+    <w:unhideWhenUsed/>
+    <w:qFormat/>
     <w:pPr>
-      <w:keepNext w:val="1"/>
-      <w:keepLines w:val="1"/>
-      <w:pageBreakBefore w:val="0"/>
-      <w:spacing w:after="80" w:before="280" w:lineRule="auto"/>
+      <w:keepNext/>
+      <w:keepLines/>
+      <w:spacing w:before="280" w:after="80"/>
+      <w:outlineLvl w:val="3"/>
     </w:pPr>
     <w:rPr>
       <w:color w:val="666666"/>
@@ -169,44 +521,76 @@
     <w:name w:val="heading 5"/>
     <w:basedOn w:val="Normal"/>
     <w:next w:val="Normal"/>
+    <w:uiPriority w:val="9"/>
+    <w:semiHidden/>
+    <w:unhideWhenUsed/>
+    <w:qFormat/>
     <w:pPr>
-      <w:keepNext w:val="1"/>
-      <w:keepLines w:val="1"/>
-      <w:pageBreakBefore w:val="0"/>
-      <w:spacing w:after="80" w:before="240" w:lineRule="auto"/>
+      <w:keepNext/>
+      <w:keepLines/>
+      <w:spacing w:before="240" w:after="80"/>
+      <w:outlineLvl w:val="4"/>
     </w:pPr>
     <w:rPr>
       <w:color w:val="666666"/>
-      <w:sz w:val="22"/>
-      <w:szCs w:val="22"/>
     </w:rPr>
   </w:style>
   <w:style w:type="paragraph" w:styleId="Heading6">
     <w:name w:val="heading 6"/>
     <w:basedOn w:val="Normal"/>
     <w:next w:val="Normal"/>
+    <w:uiPriority w:val="9"/>
+    <w:semiHidden/>
+    <w:unhideWhenUsed/>
+    <w:qFormat/>
     <w:pPr>
-      <w:keepNext w:val="1"/>
-      <w:keepLines w:val="1"/>
-      <w:pageBreakBefore w:val="0"/>
-      <w:spacing w:after="80" w:before="240" w:lineRule="auto"/>
+      <w:keepNext/>
+      <w:keepLines/>
+      <w:spacing w:before="240" w:after="80"/>
+      <w:outlineLvl w:val="5"/>
     </w:pPr>
     <w:rPr>
-      <w:i w:val="1"/>
+      <w:i/>
       <w:color w:val="666666"/>
-      <w:sz w:val="22"/>
-      <w:szCs w:val="22"/>
     </w:rPr>
+  </w:style>
+  <w:style w:type="character" w:default="1" w:styleId="DefaultParagraphFont">
+    <w:name w:val="Default Paragraph Font"/>
+    <w:uiPriority w:val="1"/>
+    <w:semiHidden/>
+    <w:unhideWhenUsed/>
+  </w:style>
+  <w:style w:type="table" w:default="1" w:styleId="TableNormal">
+    <w:name w:val="Normal Table"/>
+    <w:uiPriority w:val="99"/>
+    <w:semiHidden/>
+    <w:unhideWhenUsed/>
+    <w:tblPr>
+      <w:tblInd w:w="0" w:type="dxa"/>
+      <w:tblCellMar>
+        <w:top w:w="0" w:type="dxa"/>
+        <w:left w:w="108" w:type="dxa"/>
+        <w:bottom w:w="0" w:type="dxa"/>
+        <w:right w:w="108" w:type="dxa"/>
+      </w:tblCellMar>
+    </w:tblPr>
+  </w:style>
+  <w:style w:type="numbering" w:default="1" w:styleId="NoList">
+    <w:name w:val="No List"/>
+    <w:uiPriority w:val="99"/>
+    <w:semiHidden/>
+    <w:unhideWhenUsed/>
   </w:style>
   <w:style w:type="paragraph" w:styleId="Title">
     <w:name w:val="Title"/>
     <w:basedOn w:val="Normal"/>
     <w:next w:val="Normal"/>
+    <w:uiPriority w:val="10"/>
+    <w:qFormat/>
     <w:pPr>
-      <w:keepNext w:val="1"/>
-      <w:keepLines w:val="1"/>
-      <w:pageBreakBefore w:val="0"/>
-      <w:spacing w:after="60" w:before="0" w:lineRule="auto"/>
+      <w:keepNext/>
+      <w:keepLines/>
+      <w:spacing w:after="60"/>
     </w:pPr>
     <w:rPr>
       <w:sz w:val="52"/>
@@ -217,15 +601,14 @@
     <w:name w:val="Subtitle"/>
     <w:basedOn w:val="Normal"/>
     <w:next w:val="Normal"/>
+    <w:uiPriority w:val="11"/>
+    <w:qFormat/>
     <w:pPr>
-      <w:keepNext w:val="1"/>
-      <w:keepLines w:val="1"/>
-      <w:pageBreakBefore w:val="0"/>
-      <w:spacing w:after="320" w:before="0" w:lineRule="auto"/>
+      <w:keepNext/>
+      <w:keepLines/>
+      <w:spacing w:after="320"/>
     </w:pPr>
     <w:rPr>
-      <w:rFonts w:ascii="Arial" w:cs="Arial" w:eastAsia="Arial" w:hAnsi="Arial"/>
-      <w:i w:val="0"/>
       <w:color w:val="666666"/>
       <w:sz w:val="30"/>
       <w:szCs w:val="30"/>

</xml_diff>